<commit_message>
Added retro and different AI declaration
</commit_message>
<xml_diff>
--- a/retrospective/sprint_retrospective_Fae.docx
+++ b/retrospective/sprint_retrospective_Fae.docx
@@ -53,15 +53,6 @@
               <w:pStyle w:val="BodyText"/>
             </w:pPr>
             <w:r>
-              <w:t>August Oksavik</w:t>
-            </w:r>
-            <w:r>
-              <w:t>,</w:t>
-            </w:r>
-            <w:r>
-              <w:br/>
-            </w:r>
-            <w:r>
               <w:t>Signe Berggren Ekern,</w:t>
             </w:r>
             <w:r>
@@ -115,7 +106,7 @@
               <w:pStyle w:val="BodyText"/>
             </w:pPr>
             <w:r>
-              <w:t>n/a</w:t>
+              <w:t>August Oksavik (sickness)</w:t>
             </w:r>
           </w:p>
         </w:tc>
@@ -372,6 +363,17 @@
             <w:pPr>
               <w:pStyle w:val="ListBullet"/>
             </w:pPr>
+            <w:r>
+              <w:t>Finished most of the report</w:t>
+            </w:r>
+          </w:p>
+          <w:p>
+            <w:pPr>
+              <w:pStyle w:val="ListBullet"/>
+            </w:pPr>
+            <w:r>
+              <w:t>Got better at finding each other’s errors and faulty assumptions</w:t>
+            </w:r>
           </w:p>
         </w:tc>
         <w:tc>
@@ -404,6 +406,9 @@
             <w:pPr>
               <w:pStyle w:val="ListBullet"/>
             </w:pPr>
+            <w:r>
+              <w:t>Forgot to document report issues that were resolved in the documentation issue tracker</w:t>
+            </w:r>
           </w:p>
         </w:tc>
       </w:tr>

</xml_diff>